<commit_message>
Fase 2: Carga manual y cotizaciones
</commit_message>
<xml_diff>
--- a/Entrega_Fase2_Grupo14/2_Manuales_Usuario/MU-02_Carga_manual_cotizaciones_inventario_PLANTILLA.docx
+++ b/Entrega_Fase2_Grupo14/2_Manuales_Usuario/MU-02_Carga_manual_cotizaciones_inventario_PLANTILLA.docx
@@ -88,7 +88,7 @@
               </wp:anchor>
             </w:drawing>
           </mc:Choice>
-          <mc:Fallback xmlns:w16cei="http://schemas.microsoft.com/office/word/2026/wordml/cei" xmlns:a="http://schemas.openxmlformats.org/drawingml/2006/main" xmlns:a14="http://schemas.microsoft.com/office/drawing/2010/main" xmlns:pic="http://schemas.openxmlformats.org/drawingml/2006/picture">
+          <mc:Fallback xmlns:pic="http://schemas.openxmlformats.org/drawingml/2006/picture" xmlns:a14="http://schemas.microsoft.com/office/drawing/2010/main" xmlns:a="http://schemas.openxmlformats.org/drawingml/2006/main" xmlns:w16cei="http://schemas.microsoft.com/office/word/2026/wordml/cei">
             <w:pict>
               <v:shapetype id="_x0000_t75" coordsize="21600,21600" filled="f" stroked="f" o:spt="75" o:preferrelative="t" path="m@4@5l@4@11@9@11@9@5xe">
                 <v:stroke joinstyle="miter"/>
@@ -193,7 +193,7 @@
               </wp:inline>
             </w:drawing>
           </mc:Choice>
-          <mc:Fallback xmlns:w16cei="http://schemas.microsoft.com/office/word/2026/wordml/cei" xmlns:a14="http://schemas.microsoft.com/office/drawing/2010/main" xmlns:pic="http://schemas.openxmlformats.org/drawingml/2006/picture" xmlns:a="http://schemas.openxmlformats.org/drawingml/2006/main">
+          <mc:Fallback xmlns:a="http://schemas.openxmlformats.org/drawingml/2006/main" xmlns:pic="http://schemas.openxmlformats.org/drawingml/2006/picture" xmlns:a14="http://schemas.microsoft.com/office/drawing/2010/main" xmlns:w16cei="http://schemas.microsoft.com/office/word/2026/wordml/cei">
             <w:pict xmlns:w="http://schemas.openxmlformats.org/wordprocessingml/2006/main">
               <v:shapetype xmlns:w14="http://schemas.microsoft.com/office/word/2010/wordml" xmlns:o="urn:schemas-microsoft-com:office:office" xmlns:v="urn:schemas-microsoft-com:vml" id="_x0000_t202" coordsize="21600,21600" o:spt="202" path="m,l,21600r21600,l21600,xe" w14:anchorId="11B37122">
                 <v:stroke joinstyle="miter"/>
@@ -1582,6 +1582,7 @@
         <w:rPr>
           <w:b/>
         </w:rPr>
+        <w:lastRenderedPageBreak/>
         <w:t>MU-02 · Carga manual, cotizaciones e informe de inventario</w:t>
       </w:r>
     </w:p>
@@ -1744,6 +1745,7 @@
       </w:pPr>
       <w:bookmarkStart w:id="0" w:name="_Toc241490147"/>
       <w:r>
+        <w:lastRenderedPageBreak/>
         <w:t>Carga manual de productos, clientes y proveedores</w:t>
       </w:r>
       <w:bookmarkEnd w:id="0"/>
@@ -1791,6 +1793,43 @@
       <w:pPr>
         <w:keepNext/>
       </w:pPr>
+      <w:r>
+        <w:drawing>
+          <wp:inline distT="0" distB="0" distL="0" distR="0" wp14:anchorId="735561C0" wp14:editId="00F49A21">
+            <wp:extent cx="5875020" cy="2748280"/>
+            <wp:effectExtent l="0" t="0" r="0" b="0"/>
+            <wp:docPr id="1102135473" name="Imagen 1"/>
+            <wp:cNvGraphicFramePr>
+              <a:graphicFrameLocks xmlns:a="http://schemas.openxmlformats.org/drawingml/2006/main" noChangeAspect="1"/>
+            </wp:cNvGraphicFramePr>
+            <a:graphic xmlns:a="http://schemas.openxmlformats.org/drawingml/2006/main">
+              <a:graphicData uri="http://schemas.openxmlformats.org/drawingml/2006/picture">
+                <pic:pic xmlns:pic="http://schemas.openxmlformats.org/drawingml/2006/picture">
+                  <pic:nvPicPr>
+                    <pic:cNvPr id="1102135473" name=""/>
+                    <pic:cNvPicPr/>
+                  </pic:nvPicPr>
+                  <pic:blipFill>
+                    <a:blip r:embed="rId14"/>
+                    <a:stretch>
+                      <a:fillRect/>
+                    </a:stretch>
+                  </pic:blipFill>
+                  <pic:spPr>
+                    <a:xfrm>
+                      <a:off x="0" y="0"/>
+                      <a:ext cx="5875020" cy="2748280"/>
+                    </a:xfrm>
+                    <a:prstGeom prst="rect">
+                      <a:avLst/>
+                    </a:prstGeom>
+                  </pic:spPr>
+                </pic:pic>
+              </a:graphicData>
+            </a:graphic>
+          </wp:inline>
+        </w:drawing>
+      </w:r>
     </w:p>
     <w:p>
       <w:pPr>
@@ -1836,6 +1875,7 @@
         <w:rPr>
           <w:b/>
         </w:rPr>
+        <w:lastRenderedPageBreak/>
         <w:t>Paso 2. Agregarle su persona de contacto: Héctor Aníbal Galindo</w:t>
       </w:r>
     </w:p>
@@ -1857,6 +1897,43 @@
       <w:pPr>
         <w:keepNext/>
       </w:pPr>
+      <w:r>
+        <w:drawing>
+          <wp:inline distT="0" distB="0" distL="0" distR="0" wp14:anchorId="79D1CB58" wp14:editId="5639ABA3">
+            <wp:extent cx="5875020" cy="2955925"/>
+            <wp:effectExtent l="0" t="0" r="0" b="0"/>
+            <wp:docPr id="808658187" name="Imagen 1"/>
+            <wp:cNvGraphicFramePr>
+              <a:graphicFrameLocks xmlns:a="http://schemas.openxmlformats.org/drawingml/2006/main" noChangeAspect="1"/>
+            </wp:cNvGraphicFramePr>
+            <a:graphic xmlns:a="http://schemas.openxmlformats.org/drawingml/2006/main">
+              <a:graphicData uri="http://schemas.openxmlformats.org/drawingml/2006/picture">
+                <pic:pic xmlns:pic="http://schemas.openxmlformats.org/drawingml/2006/picture">
+                  <pic:nvPicPr>
+                    <pic:cNvPr id="808658187" name=""/>
+                    <pic:cNvPicPr/>
+                  </pic:nvPicPr>
+                  <pic:blipFill>
+                    <a:blip r:embed="rId15"/>
+                    <a:stretch>
+                      <a:fillRect/>
+                    </a:stretch>
+                  </pic:blipFill>
+                  <pic:spPr>
+                    <a:xfrm>
+                      <a:off x="0" y="0"/>
+                      <a:ext cx="5875020" cy="2955925"/>
+                    </a:xfrm>
+                    <a:prstGeom prst="rect">
+                      <a:avLst/>
+                    </a:prstGeom>
+                  </pic:spPr>
+                </pic:pic>
+              </a:graphicData>
+            </a:graphic>
+          </wp:inline>
+        </w:drawing>
+      </w:r>
     </w:p>
     <w:p>
       <w:pPr>
@@ -1916,13 +1993,59 @@
           <w:color w:val="808080"/>
           <w:sz w:val="20"/>
         </w:rPr>
-        <w:t>Ruta sugerida: Inventario › Productos › Nuevo. Nombre, Rastrear inventario, precio, costo, categoría Accesorios y equipaje, referencia interna, imagen (3_Archivos_Datos/imagenes_productos/ACC-001.png). Pestaña Compra: proveedor AccesoRuta.  Verificá el nombre exacto que muestra tu pantalla y escribí el paso con tus palabras en la línea de abajo.</w:t>
+        <w:t xml:space="preserve">Ruta sugerida: Inventario › Productos › Nuevo. Nombre, Rastrear inventario, precio, costo, categoría Accesorios y equipaje, referencia interna, imagen (3_Archivos_Datos/imagenes_productos/ACC-001.png). Pestaña Compra: </w:t>
+      </w:r>
+      <w:r>
+        <w:rPr>
+          <w:i/>
+          <w:color w:val="808080"/>
+          <w:sz w:val="20"/>
+        </w:rPr>
+        <w:lastRenderedPageBreak/>
+        <w:t>proveedor AccesoRuta.  Verificá el nombre exacto que muestra tu pantalla y escribí el paso con tus palabras en la línea de abajo.</w:t>
       </w:r>
     </w:p>
     <w:p>
       <w:pPr>
         <w:keepNext/>
       </w:pPr>
+      <w:r>
+        <w:drawing>
+          <wp:inline distT="0" distB="0" distL="0" distR="0" wp14:anchorId="507C3C3F" wp14:editId="716EB254">
+            <wp:extent cx="5875020" cy="3121660"/>
+            <wp:effectExtent l="0" t="0" r="0" b="2540"/>
+            <wp:docPr id="1824986388" name="Imagen 1"/>
+            <wp:cNvGraphicFramePr>
+              <a:graphicFrameLocks xmlns:a="http://schemas.openxmlformats.org/drawingml/2006/main" noChangeAspect="1"/>
+            </wp:cNvGraphicFramePr>
+            <a:graphic xmlns:a="http://schemas.openxmlformats.org/drawingml/2006/main">
+              <a:graphicData uri="http://schemas.openxmlformats.org/drawingml/2006/picture">
+                <pic:pic xmlns:pic="http://schemas.openxmlformats.org/drawingml/2006/picture">
+                  <pic:nvPicPr>
+                    <pic:cNvPr id="1824986388" name=""/>
+                    <pic:cNvPicPr/>
+                  </pic:nvPicPr>
+                  <pic:blipFill>
+                    <a:blip r:embed="rId16"/>
+                    <a:stretch>
+                      <a:fillRect/>
+                    </a:stretch>
+                  </pic:blipFill>
+                  <pic:spPr>
+                    <a:xfrm>
+                      <a:off x="0" y="0"/>
+                      <a:ext cx="5875020" cy="3121660"/>
+                    </a:xfrm>
+                    <a:prstGeom prst="rect">
+                      <a:avLst/>
+                    </a:prstGeom>
+                  </pic:spPr>
+                </pic:pic>
+              </a:graphicData>
+            </a:graphic>
+          </wp:inline>
+        </w:drawing>
+      </w:r>
     </w:p>
     <w:p>
       <w:pPr>
@@ -1981,6 +2104,7 @@
         <w:rPr>
           <w:b/>
         </w:rPr>
+        <w:lastRenderedPageBreak/>
         <w:t>Paso 4. Crear ACC-002 a ACC-006</w:t>
       </w:r>
     </w:p>
@@ -2002,6 +2126,43 @@
       <w:pPr>
         <w:keepNext/>
       </w:pPr>
+      <w:r>
+        <w:drawing>
+          <wp:inline distT="0" distB="0" distL="0" distR="0" wp14:anchorId="05DE1635" wp14:editId="7255E84F">
+            <wp:extent cx="5875020" cy="2501265"/>
+            <wp:effectExtent l="0" t="0" r="0" b="0"/>
+            <wp:docPr id="1104195294" name="Imagen 1"/>
+            <wp:cNvGraphicFramePr>
+              <a:graphicFrameLocks xmlns:a="http://schemas.openxmlformats.org/drawingml/2006/main" noChangeAspect="1"/>
+            </wp:cNvGraphicFramePr>
+            <a:graphic xmlns:a="http://schemas.openxmlformats.org/drawingml/2006/main">
+              <a:graphicData uri="http://schemas.openxmlformats.org/drawingml/2006/picture">
+                <pic:pic xmlns:pic="http://schemas.openxmlformats.org/drawingml/2006/picture">
+                  <pic:nvPicPr>
+                    <pic:cNvPr id="1104195294" name=""/>
+                    <pic:cNvPicPr/>
+                  </pic:nvPicPr>
+                  <pic:blipFill>
+                    <a:blip r:embed="rId17"/>
+                    <a:stretch>
+                      <a:fillRect/>
+                    </a:stretch>
+                  </pic:blipFill>
+                  <pic:spPr>
+                    <a:xfrm>
+                      <a:off x="0" y="0"/>
+                      <a:ext cx="5875020" cy="2501265"/>
+                    </a:xfrm>
+                    <a:prstGeom prst="rect">
+                      <a:avLst/>
+                    </a:prstGeom>
+                  </pic:spPr>
+                </pic:pic>
+              </a:graphicData>
+            </a:graphic>
+          </wp:inline>
+        </w:drawing>
+      </w:r>
     </w:p>
     <w:p>
       <w:pPr>
@@ -2047,6 +2208,7 @@
         <w:rPr>
           <w:b/>
         </w:rPr>
+        <w:lastRenderedPageBreak/>
         <w:t>Paso 5. Registrar su existencia inicial</w:t>
       </w:r>
     </w:p>
@@ -2068,6 +2230,43 @@
       <w:pPr>
         <w:keepNext/>
       </w:pPr>
+      <w:r>
+        <w:drawing>
+          <wp:inline distT="0" distB="0" distL="0" distR="0" wp14:anchorId="22CC0439" wp14:editId="6B69995E">
+            <wp:extent cx="5875020" cy="3117215"/>
+            <wp:effectExtent l="0" t="0" r="0" b="6985"/>
+            <wp:docPr id="63960593" name="Imagen 1"/>
+            <wp:cNvGraphicFramePr>
+              <a:graphicFrameLocks xmlns:a="http://schemas.openxmlformats.org/drawingml/2006/main" noChangeAspect="1"/>
+            </wp:cNvGraphicFramePr>
+            <a:graphic xmlns:a="http://schemas.openxmlformats.org/drawingml/2006/main">
+              <a:graphicData uri="http://schemas.openxmlformats.org/drawingml/2006/picture">
+                <pic:pic xmlns:pic="http://schemas.openxmlformats.org/drawingml/2006/picture">
+                  <pic:nvPicPr>
+                    <pic:cNvPr id="63960593" name=""/>
+                    <pic:cNvPicPr/>
+                  </pic:nvPicPr>
+                  <pic:blipFill>
+                    <a:blip r:embed="rId18"/>
+                    <a:stretch>
+                      <a:fillRect/>
+                    </a:stretch>
+                  </pic:blipFill>
+                  <pic:spPr>
+                    <a:xfrm>
+                      <a:off x="0" y="0"/>
+                      <a:ext cx="5875020" cy="3117215"/>
+                    </a:xfrm>
+                    <a:prstGeom prst="rect">
+                      <a:avLst/>
+                    </a:prstGeom>
+                  </pic:spPr>
+                </pic:pic>
+              </a:graphicData>
+            </a:graphic>
+          </wp:inline>
+        </w:drawing>
+      </w:r>
     </w:p>
     <w:p>
       <w:pPr>
@@ -2126,6 +2325,7 @@
         <w:rPr>
           <w:b/>
         </w:rPr>
+        <w:lastRenderedPageBreak/>
         <w:t>Paso 6. Crear su regla de mínimo y máximo</w:t>
       </w:r>
     </w:p>
@@ -2147,6 +2347,43 @@
       <w:pPr>
         <w:keepNext/>
       </w:pPr>
+      <w:r>
+        <w:drawing>
+          <wp:inline distT="0" distB="0" distL="0" distR="0" wp14:anchorId="3FE3CDEB" wp14:editId="3CAE4001">
+            <wp:extent cx="5875020" cy="3247390"/>
+            <wp:effectExtent l="0" t="0" r="0" b="0"/>
+            <wp:docPr id="848748882" name="Imagen 1"/>
+            <wp:cNvGraphicFramePr>
+              <a:graphicFrameLocks xmlns:a="http://schemas.openxmlformats.org/drawingml/2006/main" noChangeAspect="1"/>
+            </wp:cNvGraphicFramePr>
+            <a:graphic xmlns:a="http://schemas.openxmlformats.org/drawingml/2006/main">
+              <a:graphicData uri="http://schemas.openxmlformats.org/drawingml/2006/picture">
+                <pic:pic xmlns:pic="http://schemas.openxmlformats.org/drawingml/2006/picture">
+                  <pic:nvPicPr>
+                    <pic:cNvPr id="848748882" name=""/>
+                    <pic:cNvPicPr/>
+                  </pic:nvPicPr>
+                  <pic:blipFill>
+                    <a:blip r:embed="rId19"/>
+                    <a:stretch>
+                      <a:fillRect/>
+                    </a:stretch>
+                  </pic:blipFill>
+                  <pic:spPr>
+                    <a:xfrm>
+                      <a:off x="0" y="0"/>
+                      <a:ext cx="5875020" cy="3247390"/>
+                    </a:xfrm>
+                    <a:prstGeom prst="rect">
+                      <a:avLst/>
+                    </a:prstGeom>
+                  </pic:spPr>
+                </pic:pic>
+              </a:graphicData>
+            </a:graphic>
+          </wp:inline>
+        </w:drawing>
+      </w:r>
     </w:p>
     <w:p>
       <w:pPr>
@@ -2178,6 +2415,43 @@
       <w:pPr>
         <w:keepNext/>
       </w:pPr>
+      <w:r>
+        <w:drawing>
+          <wp:inline distT="0" distB="0" distL="0" distR="0" wp14:anchorId="483FD457" wp14:editId="7FC48E32">
+            <wp:extent cx="5875020" cy="2450465"/>
+            <wp:effectExtent l="0" t="0" r="0" b="6985"/>
+            <wp:docPr id="868568466" name="Imagen 1"/>
+            <wp:cNvGraphicFramePr>
+              <a:graphicFrameLocks xmlns:a="http://schemas.openxmlformats.org/drawingml/2006/main" noChangeAspect="1"/>
+            </wp:cNvGraphicFramePr>
+            <a:graphic xmlns:a="http://schemas.openxmlformats.org/drawingml/2006/main">
+              <a:graphicData uri="http://schemas.openxmlformats.org/drawingml/2006/picture">
+                <pic:pic xmlns:pic="http://schemas.openxmlformats.org/drawingml/2006/picture">
+                  <pic:nvPicPr>
+                    <pic:cNvPr id="868568466" name=""/>
+                    <pic:cNvPicPr/>
+                  </pic:nvPicPr>
+                  <pic:blipFill>
+                    <a:blip r:embed="rId20"/>
+                    <a:stretch>
+                      <a:fillRect/>
+                    </a:stretch>
+                  </pic:blipFill>
+                  <pic:spPr>
+                    <a:xfrm>
+                      <a:off x="0" y="0"/>
+                      <a:ext cx="5875020" cy="2450465"/>
+                    </a:xfrm>
+                    <a:prstGeom prst="rect">
+                      <a:avLst/>
+                    </a:prstGeom>
+                  </pic:spPr>
+                </pic:pic>
+              </a:graphicData>
+            </a:graphic>
+          </wp:inline>
+        </w:drawing>
+      </w:r>
     </w:p>
     <w:p>
       <w:pPr>
@@ -2220,6 +2494,7 @@
       </w:pPr>
       <w:bookmarkStart w:id="1" w:name="_Toc241490148"/>
       <w:r>
+        <w:lastRenderedPageBreak/>
         <w:t>Validación del capítulo</w:t>
       </w:r>
       <w:bookmarkEnd w:id="1"/>
@@ -2896,6 +3171,7 @@
       </w:pPr>
       <w:bookmarkStart w:id="3" w:name="_Toc241490150"/>
       <w:r>
+        <w:lastRenderedPageBreak/>
         <w:t>Configurar el flujo de cotización para talleres</w:t>
       </w:r>
       <w:bookmarkEnd w:id="3"/>
@@ -2930,6 +3206,43 @@
       <w:pPr>
         <w:keepNext/>
       </w:pPr>
+      <w:r>
+        <w:drawing>
+          <wp:inline distT="0" distB="0" distL="0" distR="0" wp14:anchorId="27421EF0" wp14:editId="0C235ECF">
+            <wp:extent cx="5875020" cy="3183255"/>
+            <wp:effectExtent l="0" t="0" r="0" b="0"/>
+            <wp:docPr id="1594786015" name="Imagen 1"/>
+            <wp:cNvGraphicFramePr>
+              <a:graphicFrameLocks xmlns:a="http://schemas.openxmlformats.org/drawingml/2006/main" noChangeAspect="1"/>
+            </wp:cNvGraphicFramePr>
+            <a:graphic xmlns:a="http://schemas.openxmlformats.org/drawingml/2006/main">
+              <a:graphicData uri="http://schemas.openxmlformats.org/drawingml/2006/picture">
+                <pic:pic xmlns:pic="http://schemas.openxmlformats.org/drawingml/2006/picture">
+                  <pic:nvPicPr>
+                    <pic:cNvPr id="1594786015" name=""/>
+                    <pic:cNvPicPr/>
+                  </pic:nvPicPr>
+                  <pic:blipFill>
+                    <a:blip r:embed="rId21"/>
+                    <a:stretch>
+                      <a:fillRect/>
+                    </a:stretch>
+                  </pic:blipFill>
+                  <pic:spPr>
+                    <a:xfrm>
+                      <a:off x="0" y="0"/>
+                      <a:ext cx="5875020" cy="3183255"/>
+                    </a:xfrm>
+                    <a:prstGeom prst="rect">
+                      <a:avLst/>
+                    </a:prstGeom>
+                  </pic:spPr>
+                </pic:pic>
+              </a:graphicData>
+            </a:graphic>
+          </wp:inline>
+        </w:drawing>
+      </w:r>
     </w:p>
     <w:p>
       <w:pPr>
@@ -2975,6 +3288,7 @@
         <w:rPr>
           <w:b/>
         </w:rPr>
+        <w:lastRenderedPageBreak/>
         <w:t>Paso 2. Crear la tarifa «Talleres B2B»</w:t>
       </w:r>
     </w:p>
@@ -2996,6 +3310,48 @@
       <w:pPr>
         <w:keepNext/>
       </w:pPr>
+      <w:r>
+        <w:drawing>
+          <wp:inline distT="0" distB="0" distL="0" distR="0" wp14:anchorId="54405190" wp14:editId="068DDED2">
+            <wp:extent cx="5875020" cy="2889885"/>
+            <wp:effectExtent l="0" t="0" r="0" b="5715"/>
+            <wp:docPr id="51192956" name="Imagen 1"/>
+            <wp:cNvGraphicFramePr>
+              <a:graphicFrameLocks xmlns:a="http://schemas.openxmlformats.org/drawingml/2006/main" noChangeAspect="1"/>
+            </wp:cNvGraphicFramePr>
+            <a:graphic xmlns:a="http://schemas.openxmlformats.org/drawingml/2006/main">
+              <a:graphicData uri="http://schemas.openxmlformats.org/drawingml/2006/picture">
+                <pic:pic xmlns:pic="http://schemas.openxmlformats.org/drawingml/2006/picture">
+                  <pic:nvPicPr>
+                    <pic:cNvPr id="51192956" name=""/>
+                    <pic:cNvPicPr/>
+                  </pic:nvPicPr>
+                  <pic:blipFill>
+                    <a:blip r:embed="rId22"/>
+                    <a:stretch>
+                      <a:fillRect/>
+                    </a:stretch>
+                  </pic:blipFill>
+                  <pic:spPr>
+                    <a:xfrm>
+                      <a:off x="0" y="0"/>
+                      <a:ext cx="5875020" cy="2889885"/>
+                    </a:xfrm>
+                    <a:prstGeom prst="rect">
+                      <a:avLst/>
+                    </a:prstGeom>
+                  </pic:spPr>
+                </pic:pic>
+              </a:graphicData>
+            </a:graphic>
+          </wp:inline>
+        </w:drawing>
+      </w:r>
+    </w:p>
+    <w:p>
+      <w:pPr>
+        <w:keepNext/>
+      </w:pPr>
     </w:p>
     <w:p>
       <w:pPr>
@@ -3054,6 +3410,7 @@
         <w:rPr>
           <w:b/>
         </w:rPr>
+        <w:lastRenderedPageBreak/>
         <w:t>Paso 3. Asignar la tarifa a los talleres</w:t>
       </w:r>
     </w:p>
@@ -3075,6 +3432,407 @@
       <w:pPr>
         <w:keepNext/>
       </w:pPr>
+      <w:r>
+        <w:drawing>
+          <wp:inline distT="0" distB="0" distL="0" distR="0" wp14:anchorId="4072577C" wp14:editId="3AA743DC">
+            <wp:extent cx="5875020" cy="3322955"/>
+            <wp:effectExtent l="0" t="0" r="0" b="0"/>
+            <wp:docPr id="538788932" name="Imagen 1"/>
+            <wp:cNvGraphicFramePr>
+              <a:graphicFrameLocks xmlns:a="http://schemas.openxmlformats.org/drawingml/2006/main" noChangeAspect="1"/>
+            </wp:cNvGraphicFramePr>
+            <a:graphic xmlns:a="http://schemas.openxmlformats.org/drawingml/2006/main">
+              <a:graphicData uri="http://schemas.openxmlformats.org/drawingml/2006/picture">
+                <pic:pic xmlns:pic="http://schemas.openxmlformats.org/drawingml/2006/picture">
+                  <pic:nvPicPr>
+                    <pic:cNvPr id="538788932" name=""/>
+                    <pic:cNvPicPr/>
+                  </pic:nvPicPr>
+                  <pic:blipFill>
+                    <a:blip r:embed="rId23"/>
+                    <a:stretch>
+                      <a:fillRect/>
+                    </a:stretch>
+                  </pic:blipFill>
+                  <pic:spPr>
+                    <a:xfrm>
+                      <a:off x="0" y="0"/>
+                      <a:ext cx="5875020" cy="3322955"/>
+                    </a:xfrm>
+                    <a:prstGeom prst="rect">
+                      <a:avLst/>
+                    </a:prstGeom>
+                  </pic:spPr>
+                </pic:pic>
+              </a:graphicData>
+            </a:graphic>
+          </wp:inline>
+        </w:drawing>
+      </w:r>
+    </w:p>
+    <w:p>
+      <w:pPr>
+        <w:keepNext/>
+      </w:pPr>
+      <w:r>
+        <w:drawing>
+          <wp:inline distT="0" distB="0" distL="0" distR="0" wp14:anchorId="23A94B5D" wp14:editId="3EA6353B">
+            <wp:extent cx="5875020" cy="2757170"/>
+            <wp:effectExtent l="0" t="0" r="0" b="5080"/>
+            <wp:docPr id="1093499103" name="Imagen 1"/>
+            <wp:cNvGraphicFramePr>
+              <a:graphicFrameLocks xmlns:a="http://schemas.openxmlformats.org/drawingml/2006/main" noChangeAspect="1"/>
+            </wp:cNvGraphicFramePr>
+            <a:graphic xmlns:a="http://schemas.openxmlformats.org/drawingml/2006/main">
+              <a:graphicData uri="http://schemas.openxmlformats.org/drawingml/2006/picture">
+                <pic:pic xmlns:pic="http://schemas.openxmlformats.org/drawingml/2006/picture">
+                  <pic:nvPicPr>
+                    <pic:cNvPr id="1093499103" name=""/>
+                    <pic:cNvPicPr/>
+                  </pic:nvPicPr>
+                  <pic:blipFill>
+                    <a:blip r:embed="rId24"/>
+                    <a:stretch>
+                      <a:fillRect/>
+                    </a:stretch>
+                  </pic:blipFill>
+                  <pic:spPr>
+                    <a:xfrm>
+                      <a:off x="0" y="0"/>
+                      <a:ext cx="5875020" cy="2757170"/>
+                    </a:xfrm>
+                    <a:prstGeom prst="rect">
+                      <a:avLst/>
+                    </a:prstGeom>
+                  </pic:spPr>
+                </pic:pic>
+              </a:graphicData>
+            </a:graphic>
+          </wp:inline>
+        </w:drawing>
+      </w:r>
+    </w:p>
+    <w:p>
+      <w:pPr>
+        <w:keepNext/>
+      </w:pPr>
+    </w:p>
+    <w:p>
+      <w:pPr>
+        <w:keepNext/>
+      </w:pPr>
+      <w:r>
+        <w:lastRenderedPageBreak/>
+        <w:drawing>
+          <wp:inline distT="0" distB="0" distL="0" distR="0" wp14:anchorId="42941EF0" wp14:editId="023C7B79">
+            <wp:extent cx="5875020" cy="2614930"/>
+            <wp:effectExtent l="0" t="0" r="0" b="0"/>
+            <wp:docPr id="79954033" name="Imagen 1"/>
+            <wp:cNvGraphicFramePr>
+              <a:graphicFrameLocks xmlns:a="http://schemas.openxmlformats.org/drawingml/2006/main" noChangeAspect="1"/>
+            </wp:cNvGraphicFramePr>
+            <a:graphic xmlns:a="http://schemas.openxmlformats.org/drawingml/2006/main">
+              <a:graphicData uri="http://schemas.openxmlformats.org/drawingml/2006/picture">
+                <pic:pic xmlns:pic="http://schemas.openxmlformats.org/drawingml/2006/picture">
+                  <pic:nvPicPr>
+                    <pic:cNvPr id="79954033" name=""/>
+                    <pic:cNvPicPr/>
+                  </pic:nvPicPr>
+                  <pic:blipFill>
+                    <a:blip r:embed="rId25"/>
+                    <a:stretch>
+                      <a:fillRect/>
+                    </a:stretch>
+                  </pic:blipFill>
+                  <pic:spPr>
+                    <a:xfrm>
+                      <a:off x="0" y="0"/>
+                      <a:ext cx="5875020" cy="2614930"/>
+                    </a:xfrm>
+                    <a:prstGeom prst="rect">
+                      <a:avLst/>
+                    </a:prstGeom>
+                  </pic:spPr>
+                </pic:pic>
+              </a:graphicData>
+            </a:graphic>
+          </wp:inline>
+        </w:drawing>
+      </w:r>
+    </w:p>
+    <w:p>
+      <w:pPr>
+        <w:keepNext/>
+      </w:pPr>
+      <w:r>
+        <w:drawing>
+          <wp:inline distT="0" distB="0" distL="0" distR="0" wp14:anchorId="1EE5BF07" wp14:editId="2C1326D7">
+            <wp:extent cx="5875020" cy="2644140"/>
+            <wp:effectExtent l="0" t="0" r="0" b="3810"/>
+            <wp:docPr id="1638435437" name="Imagen 1"/>
+            <wp:cNvGraphicFramePr>
+              <a:graphicFrameLocks xmlns:a="http://schemas.openxmlformats.org/drawingml/2006/main" noChangeAspect="1"/>
+            </wp:cNvGraphicFramePr>
+            <a:graphic xmlns:a="http://schemas.openxmlformats.org/drawingml/2006/main">
+              <a:graphicData uri="http://schemas.openxmlformats.org/drawingml/2006/picture">
+                <pic:pic xmlns:pic="http://schemas.openxmlformats.org/drawingml/2006/picture">
+                  <pic:nvPicPr>
+                    <pic:cNvPr id="1638435437" name=""/>
+                    <pic:cNvPicPr/>
+                  </pic:nvPicPr>
+                  <pic:blipFill>
+                    <a:blip r:embed="rId26"/>
+                    <a:stretch>
+                      <a:fillRect/>
+                    </a:stretch>
+                  </pic:blipFill>
+                  <pic:spPr>
+                    <a:xfrm>
+                      <a:off x="0" y="0"/>
+                      <a:ext cx="5875020" cy="2644140"/>
+                    </a:xfrm>
+                    <a:prstGeom prst="rect">
+                      <a:avLst/>
+                    </a:prstGeom>
+                  </pic:spPr>
+                </pic:pic>
+              </a:graphicData>
+            </a:graphic>
+          </wp:inline>
+        </w:drawing>
+      </w:r>
+    </w:p>
+    <w:p>
+      <w:pPr>
+        <w:keepNext/>
+      </w:pPr>
+    </w:p>
+    <w:p>
+      <w:pPr>
+        <w:keepNext/>
+      </w:pPr>
+      <w:r>
+        <w:drawing>
+          <wp:inline distT="0" distB="0" distL="0" distR="0" wp14:anchorId="3BFBB5AA" wp14:editId="11EC4C29">
+            <wp:extent cx="5875020" cy="2705100"/>
+            <wp:effectExtent l="0" t="0" r="0" b="0"/>
+            <wp:docPr id="288588508" name="Imagen 1"/>
+            <wp:cNvGraphicFramePr>
+              <a:graphicFrameLocks xmlns:a="http://schemas.openxmlformats.org/drawingml/2006/main" noChangeAspect="1"/>
+            </wp:cNvGraphicFramePr>
+            <a:graphic xmlns:a="http://schemas.openxmlformats.org/drawingml/2006/main">
+              <a:graphicData uri="http://schemas.openxmlformats.org/drawingml/2006/picture">
+                <pic:pic xmlns:pic="http://schemas.openxmlformats.org/drawingml/2006/picture">
+                  <pic:nvPicPr>
+                    <pic:cNvPr id="288588508" name=""/>
+                    <pic:cNvPicPr/>
+                  </pic:nvPicPr>
+                  <pic:blipFill>
+                    <a:blip r:embed="rId27"/>
+                    <a:stretch>
+                      <a:fillRect/>
+                    </a:stretch>
+                  </pic:blipFill>
+                  <pic:spPr>
+                    <a:xfrm>
+                      <a:off x="0" y="0"/>
+                      <a:ext cx="5875020" cy="2705100"/>
+                    </a:xfrm>
+                    <a:prstGeom prst="rect">
+                      <a:avLst/>
+                    </a:prstGeom>
+                  </pic:spPr>
+                </pic:pic>
+              </a:graphicData>
+            </a:graphic>
+          </wp:inline>
+        </w:drawing>
+      </w:r>
+    </w:p>
+    <w:p>
+      <w:pPr>
+        <w:keepNext/>
+      </w:pPr>
+      <w:r>
+        <w:lastRenderedPageBreak/>
+        <w:drawing>
+          <wp:inline distT="0" distB="0" distL="0" distR="0" wp14:anchorId="06710D98" wp14:editId="43157B8D">
+            <wp:extent cx="5875020" cy="2654935"/>
+            <wp:effectExtent l="0" t="0" r="0" b="0"/>
+            <wp:docPr id="1532395290" name="Imagen 1"/>
+            <wp:cNvGraphicFramePr>
+              <a:graphicFrameLocks xmlns:a="http://schemas.openxmlformats.org/drawingml/2006/main" noChangeAspect="1"/>
+            </wp:cNvGraphicFramePr>
+            <a:graphic xmlns:a="http://schemas.openxmlformats.org/drawingml/2006/main">
+              <a:graphicData uri="http://schemas.openxmlformats.org/drawingml/2006/picture">
+                <pic:pic xmlns:pic="http://schemas.openxmlformats.org/drawingml/2006/picture">
+                  <pic:nvPicPr>
+                    <pic:cNvPr id="1532395290" name=""/>
+                    <pic:cNvPicPr/>
+                  </pic:nvPicPr>
+                  <pic:blipFill>
+                    <a:blip r:embed="rId28"/>
+                    <a:stretch>
+                      <a:fillRect/>
+                    </a:stretch>
+                  </pic:blipFill>
+                  <pic:spPr>
+                    <a:xfrm>
+                      <a:off x="0" y="0"/>
+                      <a:ext cx="5875020" cy="2654935"/>
+                    </a:xfrm>
+                    <a:prstGeom prst="rect">
+                      <a:avLst/>
+                    </a:prstGeom>
+                  </pic:spPr>
+                </pic:pic>
+              </a:graphicData>
+            </a:graphic>
+          </wp:inline>
+        </w:drawing>
+      </w:r>
+    </w:p>
+    <w:p>
+      <w:pPr>
+        <w:keepNext/>
+      </w:pPr>
+      <w:r>
+        <w:drawing>
+          <wp:inline distT="0" distB="0" distL="0" distR="0" wp14:anchorId="278742A0" wp14:editId="7DA6A7C1">
+            <wp:extent cx="5875020" cy="2618740"/>
+            <wp:effectExtent l="0" t="0" r="0" b="0"/>
+            <wp:docPr id="1623531680" name="Imagen 1"/>
+            <wp:cNvGraphicFramePr>
+              <a:graphicFrameLocks xmlns:a="http://schemas.openxmlformats.org/drawingml/2006/main" noChangeAspect="1"/>
+            </wp:cNvGraphicFramePr>
+            <a:graphic xmlns:a="http://schemas.openxmlformats.org/drawingml/2006/main">
+              <a:graphicData uri="http://schemas.openxmlformats.org/drawingml/2006/picture">
+                <pic:pic xmlns:pic="http://schemas.openxmlformats.org/drawingml/2006/picture">
+                  <pic:nvPicPr>
+                    <pic:cNvPr id="1623531680" name=""/>
+                    <pic:cNvPicPr/>
+                  </pic:nvPicPr>
+                  <pic:blipFill>
+                    <a:blip r:embed="rId29"/>
+                    <a:stretch>
+                      <a:fillRect/>
+                    </a:stretch>
+                  </pic:blipFill>
+                  <pic:spPr>
+                    <a:xfrm>
+                      <a:off x="0" y="0"/>
+                      <a:ext cx="5875020" cy="2618740"/>
+                    </a:xfrm>
+                    <a:prstGeom prst="rect">
+                      <a:avLst/>
+                    </a:prstGeom>
+                  </pic:spPr>
+                </pic:pic>
+              </a:graphicData>
+            </a:graphic>
+          </wp:inline>
+        </w:drawing>
+      </w:r>
+    </w:p>
+    <w:p>
+      <w:pPr>
+        <w:keepNext/>
+      </w:pPr>
+      <w:r>
+        <w:drawing>
+          <wp:inline distT="0" distB="0" distL="0" distR="0" wp14:anchorId="45B246F9" wp14:editId="3BE81CDA">
+            <wp:extent cx="5875020" cy="2680970"/>
+            <wp:effectExtent l="0" t="0" r="0" b="5080"/>
+            <wp:docPr id="157058095" name="Imagen 1"/>
+            <wp:cNvGraphicFramePr>
+              <a:graphicFrameLocks xmlns:a="http://schemas.openxmlformats.org/drawingml/2006/main" noChangeAspect="1"/>
+            </wp:cNvGraphicFramePr>
+            <a:graphic xmlns:a="http://schemas.openxmlformats.org/drawingml/2006/main">
+              <a:graphicData uri="http://schemas.openxmlformats.org/drawingml/2006/picture">
+                <pic:pic xmlns:pic="http://schemas.openxmlformats.org/drawingml/2006/picture">
+                  <pic:nvPicPr>
+                    <pic:cNvPr id="157058095" name=""/>
+                    <pic:cNvPicPr/>
+                  </pic:nvPicPr>
+                  <pic:blipFill>
+                    <a:blip r:embed="rId30"/>
+                    <a:stretch>
+                      <a:fillRect/>
+                    </a:stretch>
+                  </pic:blipFill>
+                  <pic:spPr>
+                    <a:xfrm>
+                      <a:off x="0" y="0"/>
+                      <a:ext cx="5875020" cy="2680970"/>
+                    </a:xfrm>
+                    <a:prstGeom prst="rect">
+                      <a:avLst/>
+                    </a:prstGeom>
+                  </pic:spPr>
+                </pic:pic>
+              </a:graphicData>
+            </a:graphic>
+          </wp:inline>
+        </w:drawing>
+      </w:r>
+    </w:p>
+    <w:p>
+      <w:pPr>
+        <w:keepNext/>
+      </w:pPr>
+    </w:p>
+    <w:p>
+      <w:pPr>
+        <w:keepNext/>
+      </w:pPr>
+      <w:r>
+        <w:lastRenderedPageBreak/>
+        <w:drawing>
+          <wp:inline distT="0" distB="0" distL="0" distR="0" wp14:anchorId="1B78004E" wp14:editId="66BE4BA4">
+            <wp:extent cx="5875020" cy="2706370"/>
+            <wp:effectExtent l="0" t="0" r="0" b="0"/>
+            <wp:docPr id="807312127" name="Imagen 1"/>
+            <wp:cNvGraphicFramePr>
+              <a:graphicFrameLocks xmlns:a="http://schemas.openxmlformats.org/drawingml/2006/main" noChangeAspect="1"/>
+            </wp:cNvGraphicFramePr>
+            <a:graphic xmlns:a="http://schemas.openxmlformats.org/drawingml/2006/main">
+              <a:graphicData uri="http://schemas.openxmlformats.org/drawingml/2006/picture">
+                <pic:pic xmlns:pic="http://schemas.openxmlformats.org/drawingml/2006/picture">
+                  <pic:nvPicPr>
+                    <pic:cNvPr id="807312127" name=""/>
+                    <pic:cNvPicPr/>
+                  </pic:nvPicPr>
+                  <pic:blipFill>
+                    <a:blip r:embed="rId31"/>
+                    <a:stretch>
+                      <a:fillRect/>
+                    </a:stretch>
+                  </pic:blipFill>
+                  <pic:spPr>
+                    <a:xfrm>
+                      <a:off x="0" y="0"/>
+                      <a:ext cx="5875020" cy="2706370"/>
+                    </a:xfrm>
+                    <a:prstGeom prst="rect">
+                      <a:avLst/>
+                    </a:prstGeom>
+                  </pic:spPr>
+                </pic:pic>
+              </a:graphicData>
+            </a:graphic>
+          </wp:inline>
+        </w:drawing>
+      </w:r>
+    </w:p>
+    <w:p>
+      <w:pPr>
+        <w:keepNext/>
+      </w:pPr>
+    </w:p>
+    <w:p>
+      <w:pPr>
+        <w:keepNext/>
+      </w:pPr>
     </w:p>
     <w:p>
       <w:pPr>
@@ -3133,6 +3891,7 @@
         <w:rPr>
           <w:b/>
         </w:rPr>
+        <w:lastRenderedPageBreak/>
         <w:t>Paso 4. Fijar la validez de las cotizaciones</w:t>
       </w:r>
     </w:p>
@@ -3154,6 +3913,48 @@
       <w:pPr>
         <w:keepNext/>
       </w:pPr>
+      <w:r>
+        <w:drawing>
+          <wp:inline distT="0" distB="0" distL="0" distR="0" wp14:anchorId="2AA50EA7" wp14:editId="2005193D">
+            <wp:extent cx="5875020" cy="2844165"/>
+            <wp:effectExtent l="0" t="0" r="0" b="0"/>
+            <wp:docPr id="1254365202" name="Imagen 1"/>
+            <wp:cNvGraphicFramePr>
+              <a:graphicFrameLocks xmlns:a="http://schemas.openxmlformats.org/drawingml/2006/main" noChangeAspect="1"/>
+            </wp:cNvGraphicFramePr>
+            <a:graphic xmlns:a="http://schemas.openxmlformats.org/drawingml/2006/main">
+              <a:graphicData uri="http://schemas.openxmlformats.org/drawingml/2006/picture">
+                <pic:pic xmlns:pic="http://schemas.openxmlformats.org/drawingml/2006/picture">
+                  <pic:nvPicPr>
+                    <pic:cNvPr id="1254365202" name=""/>
+                    <pic:cNvPicPr/>
+                  </pic:nvPicPr>
+                  <pic:blipFill>
+                    <a:blip r:embed="rId32"/>
+                    <a:stretch>
+                      <a:fillRect/>
+                    </a:stretch>
+                  </pic:blipFill>
+                  <pic:spPr>
+                    <a:xfrm>
+                      <a:off x="0" y="0"/>
+                      <a:ext cx="5875020" cy="2844165"/>
+                    </a:xfrm>
+                    <a:prstGeom prst="rect">
+                      <a:avLst/>
+                    </a:prstGeom>
+                  </pic:spPr>
+                </pic:pic>
+              </a:graphicData>
+            </a:graphic>
+          </wp:inline>
+        </w:drawing>
+      </w:r>
+    </w:p>
+    <w:p>
+      <w:pPr>
+        <w:keepNext/>
+      </w:pPr>
     </w:p>
     <w:p>
       <w:pPr>
@@ -3195,6 +3996,43 @@
       <w:pPr>
         <w:keepNext/>
       </w:pPr>
+      <w:r>
+        <w:drawing>
+          <wp:inline distT="0" distB="0" distL="0" distR="0" wp14:anchorId="20CEA18D" wp14:editId="4EB3130C">
+            <wp:extent cx="5875020" cy="2492375"/>
+            <wp:effectExtent l="0" t="0" r="0" b="3175"/>
+            <wp:docPr id="2129739344" name="Imagen 1"/>
+            <wp:cNvGraphicFramePr>
+              <a:graphicFrameLocks xmlns:a="http://schemas.openxmlformats.org/drawingml/2006/main" noChangeAspect="1"/>
+            </wp:cNvGraphicFramePr>
+            <a:graphic xmlns:a="http://schemas.openxmlformats.org/drawingml/2006/main">
+              <a:graphicData uri="http://schemas.openxmlformats.org/drawingml/2006/picture">
+                <pic:pic xmlns:pic="http://schemas.openxmlformats.org/drawingml/2006/picture">
+                  <pic:nvPicPr>
+                    <pic:cNvPr id="2129739344" name=""/>
+                    <pic:cNvPicPr/>
+                  </pic:nvPicPr>
+                  <pic:blipFill>
+                    <a:blip r:embed="rId33"/>
+                    <a:stretch>
+                      <a:fillRect/>
+                    </a:stretch>
+                  </pic:blipFill>
+                  <pic:spPr>
+                    <a:xfrm>
+                      <a:off x="0" y="0"/>
+                      <a:ext cx="5875020" cy="2492375"/>
+                    </a:xfrm>
+                    <a:prstGeom prst="rect">
+                      <a:avLst/>
+                    </a:prstGeom>
+                  </pic:spPr>
+                </pic:pic>
+              </a:graphicData>
+            </a:graphic>
+          </wp:inline>
+        </w:drawing>
+      </w:r>
     </w:p>
     <w:p>
       <w:pPr>
@@ -3214,6 +4052,7 @@
           <w:color w:val="808080"/>
           <w:sz w:val="20"/>
         </w:rPr>
+        <w:lastRenderedPageBreak/>
         <w:t>[ captura: cotización con el descuento de talleres aplicado ]</w:t>
       </w:r>
     </w:p>
@@ -3261,6 +4100,43 @@
       <w:pPr>
         <w:keepNext/>
       </w:pPr>
+      <w:r>
+        <w:drawing>
+          <wp:inline distT="0" distB="0" distL="0" distR="0" wp14:anchorId="019F6037" wp14:editId="5A3ACC6F">
+            <wp:extent cx="5867908" cy="5494496"/>
+            <wp:effectExtent l="0" t="0" r="0" b="0"/>
+            <wp:docPr id="423741512" name="Imagen 1"/>
+            <wp:cNvGraphicFramePr>
+              <a:graphicFrameLocks xmlns:a="http://schemas.openxmlformats.org/drawingml/2006/main" noChangeAspect="1"/>
+            </wp:cNvGraphicFramePr>
+            <a:graphic xmlns:a="http://schemas.openxmlformats.org/drawingml/2006/main">
+              <a:graphicData uri="http://schemas.openxmlformats.org/drawingml/2006/picture">
+                <pic:pic xmlns:pic="http://schemas.openxmlformats.org/drawingml/2006/picture">
+                  <pic:nvPicPr>
+                    <pic:cNvPr id="423741512" name=""/>
+                    <pic:cNvPicPr/>
+                  </pic:nvPicPr>
+                  <pic:blipFill>
+                    <a:blip r:embed="rId34"/>
+                    <a:stretch>
+                      <a:fillRect/>
+                    </a:stretch>
+                  </pic:blipFill>
+                  <pic:spPr>
+                    <a:xfrm>
+                      <a:off x="0" y="0"/>
+                      <a:ext cx="5867908" cy="5494496"/>
+                    </a:xfrm>
+                    <a:prstGeom prst="rect">
+                      <a:avLst/>
+                    </a:prstGeom>
+                  </pic:spPr>
+                </pic:pic>
+              </a:graphicData>
+            </a:graphic>
+          </wp:inline>
+        </w:drawing>
+      </w:r>
     </w:p>
     <w:p>
       <w:pPr>
@@ -3319,6 +4195,7 @@
         <w:rPr>
           <w:b/>
         </w:rPr>
+        <w:lastRenderedPageBreak/>
         <w:t>Paso 3. Convertirla en pedido</w:t>
       </w:r>
     </w:p>
@@ -3340,6 +4217,43 @@
       <w:pPr>
         <w:keepNext/>
       </w:pPr>
+      <w:r>
+        <w:drawing>
+          <wp:inline distT="0" distB="0" distL="0" distR="0" wp14:anchorId="75A67CCD" wp14:editId="2D62EF0B">
+            <wp:extent cx="5875020" cy="2378075"/>
+            <wp:effectExtent l="0" t="0" r="0" b="3175"/>
+            <wp:docPr id="268183951" name="Imagen 1"/>
+            <wp:cNvGraphicFramePr>
+              <a:graphicFrameLocks xmlns:a="http://schemas.openxmlformats.org/drawingml/2006/main" noChangeAspect="1"/>
+            </wp:cNvGraphicFramePr>
+            <a:graphic xmlns:a="http://schemas.openxmlformats.org/drawingml/2006/main">
+              <a:graphicData uri="http://schemas.openxmlformats.org/drawingml/2006/picture">
+                <pic:pic xmlns:pic="http://schemas.openxmlformats.org/drawingml/2006/picture">
+                  <pic:nvPicPr>
+                    <pic:cNvPr id="268183951" name=""/>
+                    <pic:cNvPicPr/>
+                  </pic:nvPicPr>
+                  <pic:blipFill>
+                    <a:blip r:embed="rId35"/>
+                    <a:stretch>
+                      <a:fillRect/>
+                    </a:stretch>
+                  </pic:blipFill>
+                  <pic:spPr>
+                    <a:xfrm>
+                      <a:off x="0" y="0"/>
+                      <a:ext cx="5875020" cy="2378075"/>
+                    </a:xfrm>
+                    <a:prstGeom prst="rect">
+                      <a:avLst/>
+                    </a:prstGeom>
+                  </pic:spPr>
+                </pic:pic>
+              </a:graphicData>
+            </a:graphic>
+          </wp:inline>
+        </w:drawing>
+      </w:r>
     </w:p>
     <w:p>
       <w:pPr>
@@ -3398,6 +4312,7 @@
         <w:rPr>
           <w:b/>
         </w:rPr>
+        <w:lastRenderedPageBreak/>
         <w:t>Paso 4. Validar la entrega</w:t>
       </w:r>
     </w:p>
@@ -3419,6 +4334,43 @@
       <w:pPr>
         <w:keepNext/>
       </w:pPr>
+      <w:r>
+        <w:drawing>
+          <wp:inline distT="0" distB="0" distL="0" distR="0" wp14:anchorId="39CFADC1" wp14:editId="4179600B">
+            <wp:extent cx="5875020" cy="2702560"/>
+            <wp:effectExtent l="0" t="0" r="0" b="2540"/>
+            <wp:docPr id="628388889" name="Imagen 1"/>
+            <wp:cNvGraphicFramePr>
+              <a:graphicFrameLocks xmlns:a="http://schemas.openxmlformats.org/drawingml/2006/main" noChangeAspect="1"/>
+            </wp:cNvGraphicFramePr>
+            <a:graphic xmlns:a="http://schemas.openxmlformats.org/drawingml/2006/main">
+              <a:graphicData uri="http://schemas.openxmlformats.org/drawingml/2006/picture">
+                <pic:pic xmlns:pic="http://schemas.openxmlformats.org/drawingml/2006/picture">
+                  <pic:nvPicPr>
+                    <pic:cNvPr id="628388889" name=""/>
+                    <pic:cNvPicPr/>
+                  </pic:nvPicPr>
+                  <pic:blipFill>
+                    <a:blip r:embed="rId36"/>
+                    <a:stretch>
+                      <a:fillRect/>
+                    </a:stretch>
+                  </pic:blipFill>
+                  <pic:spPr>
+                    <a:xfrm>
+                      <a:off x="0" y="0"/>
+                      <a:ext cx="5875020" cy="2702560"/>
+                    </a:xfrm>
+                    <a:prstGeom prst="rect">
+                      <a:avLst/>
+                    </a:prstGeom>
+                  </pic:spPr>
+                </pic:pic>
+              </a:graphicData>
+            </a:graphic>
+          </wp:inline>
+        </w:drawing>
+      </w:r>
     </w:p>
     <w:p>
       <w:pPr>
@@ -3477,6 +4429,7 @@
         <w:rPr>
           <w:b/>
         </w:rPr>
+        <w:lastRenderedPageBreak/>
         <w:t>Paso 5. Facturar</w:t>
       </w:r>
     </w:p>
@@ -3498,6 +4451,43 @@
       <w:pPr>
         <w:keepNext/>
       </w:pPr>
+      <w:r>
+        <w:drawing>
+          <wp:inline distT="0" distB="0" distL="0" distR="0" wp14:anchorId="24C41482" wp14:editId="0E12C618">
+            <wp:extent cx="5875020" cy="2930525"/>
+            <wp:effectExtent l="0" t="0" r="0" b="3175"/>
+            <wp:docPr id="554373979" name="Imagen 1"/>
+            <wp:cNvGraphicFramePr>
+              <a:graphicFrameLocks xmlns:a="http://schemas.openxmlformats.org/drawingml/2006/main" noChangeAspect="1"/>
+            </wp:cNvGraphicFramePr>
+            <a:graphic xmlns:a="http://schemas.openxmlformats.org/drawingml/2006/main">
+              <a:graphicData uri="http://schemas.openxmlformats.org/drawingml/2006/picture">
+                <pic:pic xmlns:pic="http://schemas.openxmlformats.org/drawingml/2006/picture">
+                  <pic:nvPicPr>
+                    <pic:cNvPr id="554373979" name=""/>
+                    <pic:cNvPicPr/>
+                  </pic:nvPicPr>
+                  <pic:blipFill>
+                    <a:blip r:embed="rId37"/>
+                    <a:stretch>
+                      <a:fillRect/>
+                    </a:stretch>
+                  </pic:blipFill>
+                  <pic:spPr>
+                    <a:xfrm>
+                      <a:off x="0" y="0"/>
+                      <a:ext cx="5875020" cy="2930525"/>
+                    </a:xfrm>
+                    <a:prstGeom prst="rect">
+                      <a:avLst/>
+                    </a:prstGeom>
+                  </pic:spPr>
+                </pic:pic>
+              </a:graphicData>
+            </a:graphic>
+          </wp:inline>
+        </w:drawing>
+      </w:r>
     </w:p>
     <w:p>
       <w:pPr>
@@ -3543,6 +4533,7 @@
         <w:rPr>
           <w:b/>
         </w:rPr>
+        <w:lastRenderedPageBreak/>
         <w:t>Paso 6. Cotizaciones 2, 3 y 4</w:t>
       </w:r>
     </w:p>
@@ -3564,6 +4555,175 @@
       <w:pPr>
         <w:keepNext/>
       </w:pPr>
+      <w:r>
+        <w:drawing>
+          <wp:inline distT="0" distB="0" distL="0" distR="0" wp14:anchorId="574A5980" wp14:editId="42816F88">
+            <wp:extent cx="5875020" cy="2586355"/>
+            <wp:effectExtent l="0" t="0" r="0" b="4445"/>
+            <wp:docPr id="868741422" name="Imagen 1"/>
+            <wp:cNvGraphicFramePr>
+              <a:graphicFrameLocks xmlns:a="http://schemas.openxmlformats.org/drawingml/2006/main" noChangeAspect="1"/>
+            </wp:cNvGraphicFramePr>
+            <a:graphic xmlns:a="http://schemas.openxmlformats.org/drawingml/2006/main">
+              <a:graphicData uri="http://schemas.openxmlformats.org/drawingml/2006/picture">
+                <pic:pic xmlns:pic="http://schemas.openxmlformats.org/drawingml/2006/picture">
+                  <pic:nvPicPr>
+                    <pic:cNvPr id="868741422" name=""/>
+                    <pic:cNvPicPr/>
+                  </pic:nvPicPr>
+                  <pic:blipFill>
+                    <a:blip r:embed="rId38"/>
+                    <a:stretch>
+                      <a:fillRect/>
+                    </a:stretch>
+                  </pic:blipFill>
+                  <pic:spPr>
+                    <a:xfrm>
+                      <a:off x="0" y="0"/>
+                      <a:ext cx="5875020" cy="2586355"/>
+                    </a:xfrm>
+                    <a:prstGeom prst="rect">
+                      <a:avLst/>
+                    </a:prstGeom>
+                  </pic:spPr>
+                </pic:pic>
+              </a:graphicData>
+            </a:graphic>
+          </wp:inline>
+        </w:drawing>
+      </w:r>
+    </w:p>
+    <w:p>
+      <w:pPr>
+        <w:keepNext/>
+      </w:pPr>
+    </w:p>
+    <w:p>
+      <w:pPr>
+        <w:keepNext/>
+      </w:pPr>
+      <w:r>
+        <w:drawing>
+          <wp:inline distT="0" distB="0" distL="0" distR="0" wp14:anchorId="4AC0893B" wp14:editId="4F320C54">
+            <wp:extent cx="5875020" cy="2870835"/>
+            <wp:effectExtent l="0" t="0" r="0" b="5715"/>
+            <wp:docPr id="1914255395" name="Imagen 1"/>
+            <wp:cNvGraphicFramePr>
+              <a:graphicFrameLocks xmlns:a="http://schemas.openxmlformats.org/drawingml/2006/main" noChangeAspect="1"/>
+            </wp:cNvGraphicFramePr>
+            <a:graphic xmlns:a="http://schemas.openxmlformats.org/drawingml/2006/main">
+              <a:graphicData uri="http://schemas.openxmlformats.org/drawingml/2006/picture">
+                <pic:pic xmlns:pic="http://schemas.openxmlformats.org/drawingml/2006/picture">
+                  <pic:nvPicPr>
+                    <pic:cNvPr id="1914255395" name=""/>
+                    <pic:cNvPicPr/>
+                  </pic:nvPicPr>
+                  <pic:blipFill>
+                    <a:blip r:embed="rId39"/>
+                    <a:stretch>
+                      <a:fillRect/>
+                    </a:stretch>
+                  </pic:blipFill>
+                  <pic:spPr>
+                    <a:xfrm>
+                      <a:off x="0" y="0"/>
+                      <a:ext cx="5875020" cy="2870835"/>
+                    </a:xfrm>
+                    <a:prstGeom prst="rect">
+                      <a:avLst/>
+                    </a:prstGeom>
+                  </pic:spPr>
+                </pic:pic>
+              </a:graphicData>
+            </a:graphic>
+          </wp:inline>
+        </w:drawing>
+      </w:r>
+    </w:p>
+    <w:p>
+      <w:pPr>
+        <w:keepNext/>
+      </w:pPr>
+      <w:r>
+        <w:lastRenderedPageBreak/>
+        <w:drawing>
+          <wp:inline distT="0" distB="0" distL="0" distR="0" wp14:anchorId="6142A9F8" wp14:editId="7F3E68DA">
+            <wp:extent cx="5875020" cy="3126105"/>
+            <wp:effectExtent l="0" t="0" r="0" b="0"/>
+            <wp:docPr id="255556633" name="Imagen 1"/>
+            <wp:cNvGraphicFramePr>
+              <a:graphicFrameLocks xmlns:a="http://schemas.openxmlformats.org/drawingml/2006/main" noChangeAspect="1"/>
+            </wp:cNvGraphicFramePr>
+            <a:graphic xmlns:a="http://schemas.openxmlformats.org/drawingml/2006/main">
+              <a:graphicData uri="http://schemas.openxmlformats.org/drawingml/2006/picture">
+                <pic:pic xmlns:pic="http://schemas.openxmlformats.org/drawingml/2006/picture">
+                  <pic:nvPicPr>
+                    <pic:cNvPr id="255556633" name=""/>
+                    <pic:cNvPicPr/>
+                  </pic:nvPicPr>
+                  <pic:blipFill>
+                    <a:blip r:embed="rId40"/>
+                    <a:stretch>
+                      <a:fillRect/>
+                    </a:stretch>
+                  </pic:blipFill>
+                  <pic:spPr>
+                    <a:xfrm>
+                      <a:off x="0" y="0"/>
+                      <a:ext cx="5875020" cy="3126105"/>
+                    </a:xfrm>
+                    <a:prstGeom prst="rect">
+                      <a:avLst/>
+                    </a:prstGeom>
+                  </pic:spPr>
+                </pic:pic>
+              </a:graphicData>
+            </a:graphic>
+          </wp:inline>
+        </w:drawing>
+      </w:r>
+    </w:p>
+    <w:p>
+      <w:pPr>
+        <w:keepNext/>
+      </w:pPr>
+      <w:r>
+        <w:drawing>
+          <wp:inline distT="0" distB="0" distL="0" distR="0" wp14:anchorId="223D0CC0" wp14:editId="5D4C4806">
+            <wp:extent cx="5875020" cy="4314190"/>
+            <wp:effectExtent l="0" t="0" r="0" b="0"/>
+            <wp:docPr id="1751557123" name="Imagen 1"/>
+            <wp:cNvGraphicFramePr>
+              <a:graphicFrameLocks xmlns:a="http://schemas.openxmlformats.org/drawingml/2006/main" noChangeAspect="1"/>
+            </wp:cNvGraphicFramePr>
+            <a:graphic xmlns:a="http://schemas.openxmlformats.org/drawingml/2006/main">
+              <a:graphicData uri="http://schemas.openxmlformats.org/drawingml/2006/picture">
+                <pic:pic xmlns:pic="http://schemas.openxmlformats.org/drawingml/2006/picture">
+                  <pic:nvPicPr>
+                    <pic:cNvPr id="1751557123" name=""/>
+                    <pic:cNvPicPr/>
+                  </pic:nvPicPr>
+                  <pic:blipFill>
+                    <a:blip r:embed="rId41"/>
+                    <a:stretch>
+                      <a:fillRect/>
+                    </a:stretch>
+                  </pic:blipFill>
+                  <pic:spPr>
+                    <a:xfrm>
+                      <a:off x="0" y="0"/>
+                      <a:ext cx="5875020" cy="4314190"/>
+                    </a:xfrm>
+                    <a:prstGeom prst="rect">
+                      <a:avLst/>
+                    </a:prstGeom>
+                  </pic:spPr>
+                </pic:pic>
+              </a:graphicData>
+            </a:graphic>
+          </wp:inline>
+        </w:drawing>
+      </w:r>
     </w:p>
     <w:p>
       <w:pPr>
@@ -3606,6 +4766,7 @@
       </w:pPr>
       <w:bookmarkStart w:id="5" w:name="_Toc241490152"/>
       <w:r>
+        <w:lastRenderedPageBreak/>
         <w:t>Validación del capítulo</w:t>
       </w:r>
       <w:bookmarkEnd w:id="5"/>
@@ -4285,6 +5446,7 @@
         <w:rPr>
           <w:b/>
         </w:rPr>
+        <w:lastRenderedPageBreak/>
         <w:t>Paso 1. Existencias actuales</w:t>
       </w:r>
     </w:p>
@@ -4306,6 +5468,137 @@
       <w:pPr>
         <w:keepNext/>
       </w:pPr>
+      <w:r>
+        <w:drawing>
+          <wp:inline distT="0" distB="0" distL="0" distR="0" wp14:anchorId="294F7184" wp14:editId="0899A6B7">
+            <wp:extent cx="5875020" cy="2912745"/>
+            <wp:effectExtent l="0" t="0" r="0" b="1905"/>
+            <wp:docPr id="225857850" name="Imagen 1"/>
+            <wp:cNvGraphicFramePr>
+              <a:graphicFrameLocks xmlns:a="http://schemas.openxmlformats.org/drawingml/2006/main" noChangeAspect="1"/>
+            </wp:cNvGraphicFramePr>
+            <a:graphic xmlns:a="http://schemas.openxmlformats.org/drawingml/2006/main">
+              <a:graphicData uri="http://schemas.openxmlformats.org/drawingml/2006/picture">
+                <pic:pic xmlns:pic="http://schemas.openxmlformats.org/drawingml/2006/picture">
+                  <pic:nvPicPr>
+                    <pic:cNvPr id="225857850" name=""/>
+                    <pic:cNvPicPr/>
+                  </pic:nvPicPr>
+                  <pic:blipFill>
+                    <a:blip r:embed="rId42"/>
+                    <a:stretch>
+                      <a:fillRect/>
+                    </a:stretch>
+                  </pic:blipFill>
+                  <pic:spPr>
+                    <a:xfrm>
+                      <a:off x="0" y="0"/>
+                      <a:ext cx="5875020" cy="2912745"/>
+                    </a:xfrm>
+                    <a:prstGeom prst="rect">
+                      <a:avLst/>
+                    </a:prstGeom>
+                  </pic:spPr>
+                </pic:pic>
+              </a:graphicData>
+            </a:graphic>
+          </wp:inline>
+        </w:drawing>
+      </w:r>
+    </w:p>
+    <w:p>
+      <w:pPr>
+        <w:keepNext/>
+      </w:pPr>
+    </w:p>
+    <w:p>
+      <w:pPr>
+        <w:keepNext/>
+      </w:pPr>
+      <w:r>
+        <w:drawing>
+          <wp:inline distT="0" distB="0" distL="0" distR="0" wp14:anchorId="25548F77" wp14:editId="035BE0EC">
+            <wp:extent cx="5875020" cy="2098040"/>
+            <wp:effectExtent l="0" t="0" r="0" b="0"/>
+            <wp:docPr id="1006657684" name="Imagen 1"/>
+            <wp:cNvGraphicFramePr>
+              <a:graphicFrameLocks xmlns:a="http://schemas.openxmlformats.org/drawingml/2006/main" noChangeAspect="1"/>
+            </wp:cNvGraphicFramePr>
+            <a:graphic xmlns:a="http://schemas.openxmlformats.org/drawingml/2006/main">
+              <a:graphicData uri="http://schemas.openxmlformats.org/drawingml/2006/picture">
+                <pic:pic xmlns:pic="http://schemas.openxmlformats.org/drawingml/2006/picture">
+                  <pic:nvPicPr>
+                    <pic:cNvPr id="1006657684" name=""/>
+                    <pic:cNvPicPr/>
+                  </pic:nvPicPr>
+                  <pic:blipFill>
+                    <a:blip r:embed="rId43"/>
+                    <a:stretch>
+                      <a:fillRect/>
+                    </a:stretch>
+                  </pic:blipFill>
+                  <pic:spPr>
+                    <a:xfrm>
+                      <a:off x="0" y="0"/>
+                      <a:ext cx="5875020" cy="2098040"/>
+                    </a:xfrm>
+                    <a:prstGeom prst="rect">
+                      <a:avLst/>
+                    </a:prstGeom>
+                  </pic:spPr>
+                </pic:pic>
+              </a:graphicData>
+            </a:graphic>
+          </wp:inline>
+        </w:drawing>
+      </w:r>
+    </w:p>
+    <w:p>
+      <w:pPr>
+        <w:keepNext/>
+      </w:pPr>
+      <w:r>
+        <w:drawing>
+          <wp:inline distT="0" distB="0" distL="0" distR="0" wp14:anchorId="10886EC7" wp14:editId="79CF20F4">
+            <wp:extent cx="5875020" cy="943610"/>
+            <wp:effectExtent l="0" t="0" r="0" b="8890"/>
+            <wp:docPr id="1785531966" name="Imagen 1"/>
+            <wp:cNvGraphicFramePr>
+              <a:graphicFrameLocks xmlns:a="http://schemas.openxmlformats.org/drawingml/2006/main" noChangeAspect="1"/>
+            </wp:cNvGraphicFramePr>
+            <a:graphic xmlns:a="http://schemas.openxmlformats.org/drawingml/2006/main">
+              <a:graphicData uri="http://schemas.openxmlformats.org/drawingml/2006/picture">
+                <pic:pic xmlns:pic="http://schemas.openxmlformats.org/drawingml/2006/picture">
+                  <pic:nvPicPr>
+                    <pic:cNvPr id="1785531966" name=""/>
+                    <pic:cNvPicPr/>
+                  </pic:nvPicPr>
+                  <pic:blipFill>
+                    <a:blip r:embed="rId44"/>
+                    <a:stretch>
+                      <a:fillRect/>
+                    </a:stretch>
+                  </pic:blipFill>
+                  <pic:spPr>
+                    <a:xfrm>
+                      <a:off x="0" y="0"/>
+                      <a:ext cx="5875020" cy="943610"/>
+                    </a:xfrm>
+                    <a:prstGeom prst="rect">
+                      <a:avLst/>
+                    </a:prstGeom>
+                  </pic:spPr>
+                </pic:pic>
+              </a:graphicData>
+            </a:graphic>
+          </wp:inline>
+        </w:drawing>
+      </w:r>
+    </w:p>
+    <w:p>
+      <w:pPr>
+        <w:keepNext/>
+      </w:pPr>
     </w:p>
     <w:p>
       <w:pPr>
@@ -4325,6 +5618,7 @@
           <w:color w:val="808080"/>
           <w:sz w:val="20"/>
         </w:rPr>
+        <w:lastRenderedPageBreak/>
         <w:t>[ captura: reporte de existencias agrupado por categoría ]</w:t>
       </w:r>
     </w:p>
@@ -4385,6 +5679,43 @@
       <w:pPr>
         <w:keepNext/>
       </w:pPr>
+      <w:r>
+        <w:drawing>
+          <wp:inline distT="0" distB="0" distL="0" distR="0" wp14:anchorId="282E757A" wp14:editId="2A12FCF3">
+            <wp:extent cx="5875020" cy="1873885"/>
+            <wp:effectExtent l="0" t="0" r="0" b="0"/>
+            <wp:docPr id="892119070" name="Imagen 1"/>
+            <wp:cNvGraphicFramePr>
+              <a:graphicFrameLocks xmlns:a="http://schemas.openxmlformats.org/drawingml/2006/main" noChangeAspect="1"/>
+            </wp:cNvGraphicFramePr>
+            <a:graphic xmlns:a="http://schemas.openxmlformats.org/drawingml/2006/main">
+              <a:graphicData uri="http://schemas.openxmlformats.org/drawingml/2006/picture">
+                <pic:pic xmlns:pic="http://schemas.openxmlformats.org/drawingml/2006/picture">
+                  <pic:nvPicPr>
+                    <pic:cNvPr id="892119070" name=""/>
+                    <pic:cNvPicPr/>
+                  </pic:nvPicPr>
+                  <pic:blipFill>
+                    <a:blip r:embed="rId45"/>
+                    <a:stretch>
+                      <a:fillRect/>
+                    </a:stretch>
+                  </pic:blipFill>
+                  <pic:spPr>
+                    <a:xfrm>
+                      <a:off x="0" y="0"/>
+                      <a:ext cx="5875020" cy="1873885"/>
+                    </a:xfrm>
+                    <a:prstGeom prst="rect">
+                      <a:avLst/>
+                    </a:prstGeom>
+                  </pic:spPr>
+                </pic:pic>
+              </a:graphicData>
+            </a:graphic>
+          </wp:inline>
+        </w:drawing>
+      </w:r>
     </w:p>
     <w:p>
       <w:pPr>
@@ -4430,6 +5761,7 @@
         <w:rPr>
           <w:b/>
         </w:rPr>
+        <w:lastRenderedPageBreak/>
         <w:t>Paso 3. Alertas de stock bajo</w:t>
       </w:r>
     </w:p>
@@ -4451,6 +5783,43 @@
       <w:pPr>
         <w:keepNext/>
       </w:pPr>
+      <w:r>
+        <w:drawing>
+          <wp:inline distT="0" distB="0" distL="0" distR="0" wp14:anchorId="30C9CF51" wp14:editId="38DB395D">
+            <wp:extent cx="5875020" cy="2156460"/>
+            <wp:effectExtent l="0" t="0" r="0" b="0"/>
+            <wp:docPr id="576561489" name="Imagen 1"/>
+            <wp:cNvGraphicFramePr>
+              <a:graphicFrameLocks xmlns:a="http://schemas.openxmlformats.org/drawingml/2006/main" noChangeAspect="1"/>
+            </wp:cNvGraphicFramePr>
+            <a:graphic xmlns:a="http://schemas.openxmlformats.org/drawingml/2006/main">
+              <a:graphicData uri="http://schemas.openxmlformats.org/drawingml/2006/picture">
+                <pic:pic xmlns:pic="http://schemas.openxmlformats.org/drawingml/2006/picture">
+                  <pic:nvPicPr>
+                    <pic:cNvPr id="576561489" name=""/>
+                    <pic:cNvPicPr/>
+                  </pic:nvPicPr>
+                  <pic:blipFill>
+                    <a:blip r:embed="rId46"/>
+                    <a:stretch>
+                      <a:fillRect/>
+                    </a:stretch>
+                  </pic:blipFill>
+                  <pic:spPr>
+                    <a:xfrm>
+                      <a:off x="0" y="0"/>
+                      <a:ext cx="5875020" cy="2156460"/>
+                    </a:xfrm>
+                    <a:prstGeom prst="rect">
+                      <a:avLst/>
+                    </a:prstGeom>
+                  </pic:spPr>
+                </pic:pic>
+              </a:graphicData>
+            </a:graphic>
+          </wp:inline>
+        </w:drawing>
+      </w:r>
     </w:p>
     <w:p>
       <w:pPr>
@@ -4600,6 +5969,7 @@
                 <w:b/>
                 <w:sz w:val="20"/>
               </w:rPr>
+              <w:lastRenderedPageBreak/>
               <w:t>Indicador</w:t>
             </w:r>
           </w:p>
@@ -4967,7 +6337,7 @@
       </w:pPr>
     </w:p>
     <w:sectPr>
-      <w:footerReference w:type="default" r:id="rId14"/>
+      <w:footerReference w:type="default" r:id="rId47"/>
       <w:pgSz w:w="11906" w:h="16838"/>
       <w:pgMar w:top="1327" w:right="1327" w:bottom="1327" w:left="1327" w:header="720" w:footer="720" w:gutter="0"/>
       <w:pgNumType w:start="0"/>

</xml_diff>